<commit_message>
feat: complete Sentry integration, unified realtime notifications and wave payments updates
</commit_message>
<xml_diff>
--- a/flux-utilisateur/paiement/Paiement_Wave_Direct_Manuel.docx
+++ b/flux-utilisateur/paiement/Paiement_Wave_Direct_Manuel.docx
@@ -554,19 +554,21 @@
         <w:br/>
         <w:t xml:space="preserve">        Admin-&gt;&gt;API: 9. Clic sur "Valider le Reçu"</w:t>
         <w:br/>
-        <w:t xml:space="preserve">        API-&gt;&gt;DB: 10. PATCH /api/admin/orders (payment_status: 'succeeded', status: 'paid')</w:t>
+        <w:t xml:space="preserve">        API-&gt;&gt;DB: 10. UPDATE orders (payment_status: 'succeeded', status: 'paid')</w:t>
         <w:br/>
-        <w:t xml:space="preserve">        DB-&gt;&gt;DB: Trigger PostgreSQL notifie le client ("Paiement confirmé !")</w:t>
+        <w:t xml:space="preserve">        API-&gt;&gt;DB: 11. INSERT INTO notifications ('payment_success')</w:t>
         <w:br/>
-        <w:t xml:space="preserve">        DB--&gt;&gt;Client: 11. Statut passe à "Payée" (Bouton Payer masqué définitivement)</w:t>
+        <w:t xml:space="preserve">        DB--&gt;&gt;Client: 12. Supabase Realtime intercepte l'ajout, affiche Toast &amp; Incrémente Cloche</w:t>
         <w:br/>
         <w:t xml:space="preserve">    else CAS B : Reçu Invalide (Admin rejette)</w:t>
         <w:br/>
         <w:t xml:space="preserve">        Admin-&gt;&gt;API: 9. Clic sur "Marquer comme Échoué"</w:t>
         <w:br/>
-        <w:t xml:space="preserve">        API-&gt;&gt;DB: 10. PATCH /api/admin/orders (payment_status: 'failed', status: 'failed')</w:t>
+        <w:t xml:space="preserve">        API-&gt;&gt;DB: 10. UPDATE orders (payment_status: 'failed', status: 'failed')</w:t>
         <w:br/>
-        <w:t xml:space="preserve">        DB--&gt;&gt;Client: 11. Le bouton "Payer / Resoumettre" réapparaît</w:t>
+        <w:t xml:space="preserve">        API-&gt;&gt;DB: 11. INSERT INTO notifications ('payment_failed')</w:t>
+        <w:br/>
+        <w:t xml:space="preserve">        DB--&gt;&gt;Client: 12. Supabase Realtime intercepte l'ajout, affiche Toast &amp; Incrémente Cloche (Bouton Payer réapparaît)</w:t>
         <w:br/>
         <w:t xml:space="preserve">    end</w:t>
         <w:br/>
@@ -715,7 +717,7 @@
         <w:spacing w:after="80"/>
       </w:pPr>
       <w:r>
-        <w:t>L'admin clique sur "Valider le Reçu" (Marquer comme Payé). L'application émet la requête `PATCH /api/admin/orders`. Le serveur applique `payment_status = 'succeeded'` et `status = 'paid'`. Le trigger PostgreSQL notifie automatiquement le client (*"Paiement confirmé !"*). Le statut passe à "Payée" et le bouton Payer est retiré définitivement.</w:t>
+        <w:t>L'admin clique sur "Valider le Reçu" (Marquer comme Payé). L'application émet la requête `PATCH /api/admin/orders`. Le serveur applique `payment_status = 'succeeded'` et `status = 'paid'`, puis insère obligatoirement une notification de confirmation dans la table `notifications`. Supabase Realtime pousse l'alerte à la cloche du client en instantané. Le statut passe à "Payée" et le bouton Payer est retiré définitivement.</w:t>
       </w:r>
     </w:p>
     <w:p>
@@ -753,7 +755,7 @@
         <w:spacing w:after="80"/>
       </w:pPr>
       <w:r>
-        <w:t>Étape C.2 — Mutation BD &amp; Réaffichage du Bouton Payer</w:t>
+        <w:t>Étape C.2 — Mutation BD, Notification Push &amp; Réaffichage du Bouton Payer</w:t>
       </w:r>
     </w:p>
     <w:p>
@@ -761,7 +763,7 @@
         <w:spacing w:after="80"/>
       </w:pPr>
       <w:r>
-        <w:t>L'application enregistre `payment_status = 'failed'` et `status = 'failed'`. Le client reçoit une notification d'échec et le bouton "Payer / Réessayer" réapparaît sur son tableau de bord pour lui permettre de soumettre un nouveau reçu ou de passer par GeniusPay.</w:t>
+        <w:t>L'application enregistre `payment_status = 'failed'` et `status = 'failed'`, puis insère l'erreur détaillée dans la table `notifications`. Le client reçoit une alerte Push (Toast + Cloche incrémentée) et le bouton "Payer / Réessayer" réapparaît sur son tableau de bord pour lui permettre de soumettre un nouveau reçu ou de passer par GeniusPay.</w:t>
       </w:r>
     </w:p>
     <w:p>

</xml_diff>